<commit_message>
docs: regenerate Hermes instructions docx v1.3 (contact_id + live token note)
Co-Authored-By: Claude Opus 4.8 <noreply@anthropic.com>
</commit_message>
<xml_diff>
--- a/prom-marketing/docs/Хермес-инструкции.docx
+++ b/prom-marketing/docs/Хермес-инструкции.docx
@@ -32,7 +32,7 @@
           <w:sz w:val="24"/>
           <w:szCs w:val="24"/>
         </w:rPr>
-        <w:t xml:space="preserve">Как Hermes поддържа CRM-а на ProMarketing жив и точен, без да го разваля. Версия 1.2 · 04.06.2026 · валута: EUR · API: внедрен и жив</w:t>
+        <w:t xml:space="preserve">Как Hermes поддържа CRM-а на ProMarketing жив и точен, без да го разваля. Версия 1.3 · 04.06.2026 · валута: EUR · API: внедрен и жив</w:t>
       </w:r>
     </w:p>
     <w:p>
@@ -1601,6 +1601,112 @@
           <w:szCs w:val="22"/>
         </w:rPr>
         <w:t xml:space="preserve">, приемат/връщат JSON и са идемпотентни.</w:t>
+      </w:r>
+    </w:p>
+    <w:p>
+      <w:pPr>
+        <w:spacing w:after="100" w:line="276"/>
+      </w:pPr>
+      <w:r>
+        <w:rPr>
+          <w:rFonts w:ascii="Calibri" w:cs="Calibri" w:eastAsia="Calibri" w:hAnsi="Calibri"/>
+          <w:b/>
+          <w:bCs/>
+          <w:color w:val="1E7F43"/>
+          <w:sz w:val="22"/>
+          <w:szCs w:val="22"/>
+        </w:rPr>
+        <w:t xml:space="preserve">Жив токен (важно): </w:t>
+      </w:r>
+      <w:r>
+        <w:rPr>
+          <w:rFonts w:ascii="Calibri" w:cs="Calibri" w:eastAsia="Calibri" w:hAnsi="Calibri"/>
+          <w:sz w:val="22"/>
+          <w:szCs w:val="22"/>
+        </w:rPr>
+        <w:t xml:space="preserve">приложението вече има </w:t>
+      </w:r>
+      <w:r>
+        <w:rPr>
+          <w:rFonts w:ascii="Consolas" w:cs="Consolas" w:eastAsia="Consolas" w:hAnsi="Consolas"/>
+          <w:sz w:val="20"/>
+          <w:szCs w:val="20"/>
+        </w:rPr>
+        <w:t xml:space="preserve">INTERNAL_SEND_TOKEN</w:t>
+      </w:r>
+      <w:r>
+        <w:rPr>
+          <w:rFonts w:ascii="Calibri" w:cs="Calibri" w:eastAsia="Calibri" w:hAnsi="Calibri"/>
+          <w:sz w:val="22"/>
+          <w:szCs w:val="22"/>
+        </w:rPr>
+        <w:t xml:space="preserve"> в Vercel. За да пише Hermes, постави СЪЩАТА стойност в </w:t>
+      </w:r>
+      <w:r>
+        <w:rPr>
+          <w:rFonts w:ascii="Consolas" w:cs="Consolas" w:eastAsia="Consolas" w:hAnsi="Consolas"/>
+          <w:sz w:val="20"/>
+          <w:szCs w:val="20"/>
+        </w:rPr>
+        <w:t xml:space="preserve">/root/.hermes/.env</w:t>
+      </w:r>
+      <w:r>
+        <w:rPr>
+          <w:rFonts w:ascii="Calibri" w:cs="Calibri" w:eastAsia="Calibri" w:hAnsi="Calibri"/>
+          <w:sz w:val="22"/>
+          <w:szCs w:val="22"/>
+        </w:rPr>
+        <w:t xml:space="preserve"> (като </w:t>
+      </w:r>
+      <w:r>
+        <w:rPr>
+          <w:rFonts w:ascii="Consolas" w:cs="Consolas" w:eastAsia="Consolas" w:hAnsi="Consolas"/>
+          <w:sz w:val="20"/>
+          <w:szCs w:val="20"/>
+        </w:rPr>
+        <w:t xml:space="preserve">HERMES_API_TOKEN</w:t>
+      </w:r>
+      <w:r>
+        <w:rPr>
+          <w:rFonts w:ascii="Calibri" w:cs="Calibri" w:eastAsia="Calibri" w:hAnsi="Calibri"/>
+          <w:sz w:val="22"/>
+          <w:szCs w:val="22"/>
+        </w:rPr>
+        <w:t xml:space="preserve"> или </w:t>
+      </w:r>
+      <w:r>
+        <w:rPr>
+          <w:rFonts w:ascii="Consolas" w:cs="Consolas" w:eastAsia="Consolas" w:hAnsi="Consolas"/>
+          <w:sz w:val="20"/>
+          <w:szCs w:val="20"/>
+        </w:rPr>
+        <w:t xml:space="preserve">INTERNAL_SEND_TOKEN</w:t>
+      </w:r>
+      <w:r>
+        <w:rPr>
+          <w:rFonts w:ascii="Calibri" w:cs="Calibri" w:eastAsia="Calibri" w:hAnsi="Calibri"/>
+          <w:sz w:val="22"/>
+          <w:szCs w:val="22"/>
+        </w:rPr>
+        <w:t xml:space="preserve">). Не е нужен нов app-токен — env-ът на app-а е в </w:t>
+      </w:r>
+      <w:r>
+        <w:rPr>
+          <w:rFonts w:ascii="Calibri" w:cs="Calibri" w:eastAsia="Calibri" w:hAnsi="Calibri"/>
+          <w:b/>
+          <w:bCs/>
+          <w:sz w:val="22"/>
+          <w:szCs w:val="22"/>
+        </w:rPr>
+        <w:t xml:space="preserve">Vercel</w:t>
+      </w:r>
+      <w:r>
+        <w:rPr>
+          <w:rFonts w:ascii="Calibri" w:cs="Calibri" w:eastAsia="Calibri" w:hAnsi="Calibri"/>
+          <w:sz w:val="22"/>
+          <w:szCs w:val="22"/>
+        </w:rPr>
+        <w:t xml:space="preserve">, не в Supabase.</w:t>
       </w:r>
     </w:p>
     <w:p>
@@ -3076,6 +3182,51 @@
           <w:szCs w:val="22"/>
         </w:rPr>
         <w:t xml:space="preserve">Find-or-create контакт + (по избор) идемпотентна активност + patch на follow-up полета.</w:t>
+      </w:r>
+    </w:p>
+    <w:p>
+      <w:pPr>
+        <w:spacing w:after="100" w:line="276"/>
+      </w:pPr>
+      <w:r>
+        <w:rPr>
+          <w:rFonts w:ascii="Calibri" w:cs="Calibri" w:eastAsia="Calibri" w:hAnsi="Calibri"/>
+          <w:sz w:val="22"/>
+          <w:szCs w:val="22"/>
+        </w:rPr>
+        <w:t xml:space="preserve">Може да подадеш и </w:t>
+      </w:r>
+      <w:r>
+        <w:rPr>
+          <w:rFonts w:ascii="Consolas" w:cs="Consolas" w:eastAsia="Consolas" w:hAnsi="Consolas"/>
+          <w:sz w:val="20"/>
+          <w:szCs w:val="20"/>
+        </w:rPr>
+        <w:t xml:space="preserve">contact_id</w:t>
+      </w:r>
+      <w:r>
+        <w:rPr>
+          <w:rFonts w:ascii="Calibri" w:cs="Calibri" w:eastAsia="Calibri" w:hAnsi="Calibri"/>
+          <w:sz w:val="22"/>
+          <w:szCs w:val="22"/>
+        </w:rPr>
+        <w:t xml:space="preserve"> директно вместо email/phone — така се правят </w:t>
+      </w:r>
+      <w:r>
+        <w:rPr>
+          <w:rFonts w:ascii="Consolas" w:cs="Consolas" w:eastAsia="Consolas" w:hAnsi="Consolas"/>
+          <w:sz w:val="19"/>
+          <w:szCs w:val="19"/>
+        </w:rPr>
+        <w:t xml:space="preserve">set-stage / set-followup / add-note</w:t>
+      </w:r>
+      <w:r>
+        <w:rPr>
+          <w:rFonts w:ascii="Calibri" w:cs="Calibri" w:eastAsia="Calibri" w:hAnsi="Calibri"/>
+          <w:sz w:val="22"/>
+          <w:szCs w:val="22"/>
+        </w:rPr>
+        <w:t xml:space="preserve"> по известен контакт.</w:t>
       </w:r>
     </w:p>
     <w:p>

</xml_diff>

<commit_message>
docs: Hermes naръчник v1.4 (GET manual-review, invoice audit, email interlock)
Co-Authored-By: Claude Opus 4.8 <noreply@anthropic.com>
</commit_message>
<xml_diff>
--- a/prom-marketing/docs/Хермес-инструкции.docx
+++ b/prom-marketing/docs/Хермес-инструкции.docx
@@ -32,7 +32,7 @@
           <w:sz w:val="24"/>
           <w:szCs w:val="24"/>
         </w:rPr>
-        <w:t xml:space="preserve">Как Hermes поддържа CRM-а на ProMarketing жив и точен, без да го разваля. Версия 1.3 · 04.06.2026 · валута: EUR · API: внедрен и жив</w:t>
+        <w:t xml:space="preserve">Как Hermes поддържа CRM-а на ProMarketing жив и точен, без да го разваля. Версия 1.4 · 04.06.2026 · валута: EUR · API: внедрен и жив</w:t>
       </w:r>
     </w:p>
     <w:p>
@@ -3140,6 +3140,83 @@
           </w:p>
         </w:tc>
       </w:tr>
+      <w:tr>
+        <w:tc>
+          <w:tcPr>
+            <w:tcW w:type="pct" w:w="12%"/>
+            <w:shd w:fill="F7F9FB" w:color="auto" w:val="clear"/>
+            <w:tcMar>
+              <w:top w:type="dxa" w:w="60"/>
+              <w:left w:type="dxa" w:w="100"/>
+              <w:bottom w:type="dxa" w:w="60"/>
+              <w:right w:type="dxa" w:w="100"/>
+            </w:tcMar>
+          </w:tcPr>
+          <w:p>
+            <w:r>
+              <w:rPr>
+                <w:rFonts w:ascii="Calibri" w:cs="Calibri" w:eastAsia="Calibri" w:hAnsi="Calibri"/>
+                <w:b w:val="false"/>
+                <w:bCs w:val="false"/>
+                <w:color w:val="1B2733"/>
+                <w:sz w:val="19"/>
+                <w:szCs w:val="19"/>
+              </w:rPr>
+              <w:t xml:space="preserve">GET</w:t>
+            </w:r>
+          </w:p>
+        </w:tc>
+        <w:tc>
+          <w:tcPr>
+            <w:tcW w:type="pct" w:w="36%"/>
+            <w:shd w:fill="F7F9FB" w:color="auto" w:val="clear"/>
+            <w:tcMar>
+              <w:top w:type="dxa" w:w="60"/>
+              <w:left w:type="dxa" w:w="100"/>
+              <w:bottom w:type="dxa" w:w="60"/>
+              <w:right w:type="dxa" w:w="100"/>
+            </w:tcMar>
+          </w:tcPr>
+          <w:p>
+            <w:r>
+              <w:rPr>
+                <w:rFonts w:ascii="Calibri" w:cs="Calibri" w:eastAsia="Calibri" w:hAnsi="Calibri"/>
+                <w:b w:val="false"/>
+                <w:bCs w:val="false"/>
+                <w:color w:val="1B2733"/>
+                <w:sz w:val="19"/>
+                <w:szCs w:val="19"/>
+              </w:rPr>
+              <w:t xml:space="preserve">/api/crm/manual-review</w:t>
+            </w:r>
+          </w:p>
+        </w:tc>
+        <w:tc>
+          <w:tcPr>
+            <w:tcW w:type="pct" w:w="52%"/>
+            <w:shd w:fill="F7F9FB" w:color="auto" w:val="clear"/>
+            <w:tcMar>
+              <w:top w:type="dxa" w:w="60"/>
+              <w:left w:type="dxa" w:w="100"/>
+              <w:bottom w:type="dxa" w:w="60"/>
+              <w:right w:type="dxa" w:w="100"/>
+            </w:tcMar>
+          </w:tcPr>
+          <w:p>
+            <w:r>
+              <w:rPr>
+                <w:rFonts w:ascii="Calibri" w:cs="Calibri" w:eastAsia="Calibri" w:hAnsi="Calibri"/>
+                <w:b w:val="false"/>
+                <w:bCs w:val="false"/>
+                <w:color w:val="1B2733"/>
+                <w:sz w:val="19"/>
+                <w:szCs w:val="19"/>
+              </w:rPr>
+              <w:t xml:space="preserve">Чете: активни за проверка (?status=needs_user)</w:t>
+            </w:r>
+          </w:p>
+        </w:tc>
+      </w:tr>
     </w:tbl>
     <w:p>
       <w:pPr>
@@ -4313,7 +4390,52 @@
           <w:sz w:val="22"/>
           <w:szCs w:val="22"/>
         </w:rPr>
-        <w:t xml:space="preserve">. Дедуп: не създава втори активен елемент за същия проблем.</w:t>
+        <w:t xml:space="preserve">. Дедуп: не създава втори активен елемент (open/needs_user/blocked) за същия проблем.</w:t>
+      </w:r>
+    </w:p>
+    <w:p>
+      <w:pPr>
+        <w:spacing w:after="100" w:line="276"/>
+      </w:pPr>
+      <w:r>
+        <w:rPr>
+          <w:rFonts w:ascii="Calibri" w:cs="Calibri" w:eastAsia="Calibri" w:hAnsi="Calibri"/>
+          <w:sz w:val="22"/>
+          <w:szCs w:val="22"/>
+        </w:rPr>
+        <w:t xml:space="preserve">Дневен преглед (само четене): </w:t>
+      </w:r>
+      <w:r>
+        <w:rPr>
+          <w:rFonts w:ascii="Consolas" w:cs="Consolas" w:eastAsia="Consolas" w:hAnsi="Consolas"/>
+          <w:sz w:val="19"/>
+          <w:szCs w:val="19"/>
+        </w:rPr>
+        <w:t xml:space="preserve">GET /api/crm/manual-review?status=needs_user</w:t>
+      </w:r>
+      <w:r>
+        <w:rPr>
+          <w:rFonts w:ascii="Calibri" w:cs="Calibri" w:eastAsia="Calibri" w:hAnsi="Calibri"/>
+          <w:sz w:val="22"/>
+          <w:szCs w:val="22"/>
+        </w:rPr>
+        <w:t xml:space="preserve"> — връща активните за проверка със заглавия (без сурово описание), с </w:t>
+      </w:r>
+      <w:r>
+        <w:rPr>
+          <w:rFonts w:ascii="Consolas" w:cs="Consolas" w:eastAsia="Consolas" w:hAnsi="Consolas"/>
+          <w:sz w:val="19"/>
+          <w:szCs w:val="19"/>
+        </w:rPr>
+        <w:t xml:space="preserve">limit/offset</w:t>
+      </w:r>
+      <w:r>
+        <w:rPr>
+          <w:rFonts w:ascii="Calibri" w:cs="Calibri" w:eastAsia="Calibri" w:hAnsi="Calibri"/>
+          <w:sz w:val="22"/>
+          <w:szCs w:val="22"/>
+        </w:rPr>
+        <w:t xml:space="preserve">.</w:t>
       </w:r>
     </w:p>
     <w:p>
@@ -5397,6 +5519,66 @@
           <w:szCs w:val="22"/>
         </w:rPr>
         <w:t xml:space="preserve">, за да са видими в профила.</w:t>
+      </w:r>
+    </w:p>
+    <w:p>
+      <w:pPr>
+        <w:pStyle w:val="ListParagraph"/>
+        <w:numPr>
+          <w:ilvl w:val="0"/>
+          <w:numId w:val="1"/>
+        </w:numPr>
+        <w:spacing w:after="40" w:line="264"/>
+      </w:pPr>
+      <w:r>
+        <w:rPr>
+          <w:rFonts w:ascii="Calibri" w:cs="Calibri" w:eastAsia="Calibri" w:hAnsi="Calibri"/>
+          <w:b/>
+          <w:bCs/>
+          <w:sz w:val="22"/>
+          <w:szCs w:val="22"/>
+        </w:rPr>
+        <w:t xml:space="preserve">Технически интерлок</w:t>
+      </w:r>
+      <w:r>
+        <w:rPr>
+          <w:rFonts w:ascii="Calibri" w:cs="Calibri" w:eastAsia="Calibri" w:hAnsi="Calibri"/>
+          <w:sz w:val="22"/>
+          <w:szCs w:val="22"/>
+        </w:rPr>
+        <w:t xml:space="preserve">: </w:t>
+      </w:r>
+      <w:r>
+        <w:rPr>
+          <w:rFonts w:ascii="Consolas" w:cs="Consolas" w:eastAsia="Consolas" w:hAnsi="Consolas"/>
+          <w:sz w:val="19"/>
+          <w:szCs w:val="19"/>
+        </w:rPr>
+        <w:t xml:space="preserve">/api/email/send</w:t>
+      </w:r>
+      <w:r>
+        <w:rPr>
+          <w:rFonts w:ascii="Calibri" w:cs="Calibri" w:eastAsia="Calibri" w:hAnsi="Calibri"/>
+          <w:sz w:val="22"/>
+          <w:szCs w:val="22"/>
+        </w:rPr>
+        <w:t xml:space="preserve"> с токен към НЕ-собственик изисква </w:t>
+      </w:r>
+      <w:r>
+        <w:rPr>
+          <w:rFonts w:ascii="Consolas" w:cs="Consolas" w:eastAsia="Consolas" w:hAnsi="Consolas"/>
+          <w:sz w:val="19"/>
+          <w:szCs w:val="19"/>
+        </w:rPr>
+        <w:t xml:space="preserve">approved:true</w:t>
+      </w:r>
+      <w:r>
+        <w:rPr>
+          <w:rFonts w:ascii="Calibri" w:cs="Calibri" w:eastAsia="Calibri" w:hAnsi="Calibri"/>
+          <w:sz w:val="22"/>
+          <w:szCs w:val="22"/>
+        </w:rPr>
+        <w:t xml:space="preserve">. Preview към собственика е свободно; welcome авто-имейлите ползват отделен път.</w:t>
       </w:r>
     </w:p>
     <w:p>

</xml_diff>